<commit_message>
LSO List A: verified MFM points, drop Lancer's Sigil, lock 1,995/2000
- Pulled Knights points from BSData (= current MFM): Castellan 400, Crusader
  395, Cerastus Lancer 415, Armiger Helverin 140, Navigator 75; enhancements
  Blessed Plate 30, Judicant's Helm 25, Sanctuary 20. Resolves the 400-vs-425 hedge.
- Drop Bearer of the Lancer's Sigil (user: not worth it). Blessed Plate is the
  taken enhancement; Judicant's Helm + Sanctuary benched.
- Lock List A = 2 Castellan / 1 Lancer / 1 Crusader / 2 Armiger / Navigator +
  Blessed Plate = 1,995/2000 (2nd Armiger is the points-efficient fill vs
  wasting ~95 on one). Regenerated all three docs.

Still pending user confirmation: 'Rotate Ion Shields' NOT found anywhere in the
11E faction pack/core (flat 5++ vs ranged only) — the ~8 heist 'Rotate' mentions
+ the RULES entry are unchanged until confirmed.

Co-Authored-By: Claude Opus 4.8 (1M context) <noreply@anthropic.com>
</commit_message>
<xml_diff>
--- a/docs/Reports & Plans/LSO-Runbook.docx
+++ b/docs/Reports & Plans/LSO-Runbook.docx
@@ -111,10 +111,10 @@
         <w:rPr>
           <w:b/>
         </w:rPr>
-        <w:t xml:space="preserve">1x Armiger Helverin (140) — </w:t>
-      </w:r>
-      <w:r>
-        <w:t>Backfield 48" autocannons + cheap OC6 body / screen.</w:t>
+        <w:t xml:space="preserve">2x Armiger Helverin (140 ea) — </w:t>
+      </w:r>
+      <w:r>
+        <w:t>TWO backfield 48" autocannon platforms + OC6 screens — the points-efficient fill (a single Armiger wastes ~95 pts) + extra OC for the melee-heavy meta.</w:t>
       </w:r>
     </w:p>
     <w:p>
@@ -1398,7 +1398,7 @@
     </w:p>
     <w:p>
       <w:r>
-        <w:t>Realistic 300+ GT expectation (re-verified): a positive-but-underdog record, roughly 3-3 to 4-2 over 5-6 rounds (~55-65% game win rate, pairing-skewed). Bank the broad early/mid field (the favourable + winnable coin-flips); slide toward losses as the top cut concentrates the filth (Necrons/T'au/Ravenwing/AdMech/SW). Correct Knight goal: strong positive + steal a couple you shouldn't win — NOT winning the event. The 2-Castellan shooting core IMPROVES this over 2-Lancer (more removal-race firepower for exactly the hard matchups). List blind spots (priority order): (1) ~85-175 pts unspent + ZERO enhancements = fix to 2000 first; (2) only ONE 4++ Lancer into a melee-heavy field — accepted price of shooting-dominance; mitigate by killing deliverers pre-charge + Lancer's-Sigil charge re-roll, NOT a 2nd blade; (3) screening deep-strike alphas (BA/SW/Votann/GSC) with only ~5 combat models — the Navigator dome is load-bearing; (4) anti-horde is moderate (accept Green Tide); (5) out-OC'd by most of the field -&gt; lock PURGE THE FOE (kill-weighted) over Priority Assets.</w:t>
+        <w:t>Realistic 300+ GT expectation (re-verified): a positive-but-underdog record, roughly 3-3 to 4-2 over 5-6 rounds (~55-65% game win rate, pairing-skewed). Bank the broad early/mid field (the favourable + winnable coin-flips); slide toward losses as the top cut concentrates the filth (Necrons/T'au/Ravenwing/AdMech/SW). Correct Knight goal: strong positive + steal a couple you shouldn't win — NOT winning the event. The 2-Castellan shooting core IMPROVES this over 2-Lancer (more removal-race firepower for exactly the hard matchups). List blind spots (priority order): (1) [RESOLVED] now costed to 1,995/2000 (2nd Armiger + Blessed Plate); (2) only ONE 4++ Lancer into a melee-heavy field — accepted price of shooting-dominance; mitigate by killing deliverers pre-charge, NOT a 2nd blade; (3) screening deep-strike alphas (BA/SW/Votann/GSC) with only ~5 combat models — the Navigator dome is load-bearing; (4) anti-horde is moderate (accept Green Tide); (5) out-OC'd by most of the field -&gt; lock PURGE THE FOE (kill-weighted) over Priority Assets.</w:t>
       </w:r>
     </w:p>
     <w:p>

</xml_diff>

<commit_message>
Runbook: add standing Helverin/Crusader Bondsman reminder to the cheat-sheet
Every-turn reminder in the rules cheat-sheet (prints ahead of all battle plans):
keep the Helverin in the Crusader's Bondsman range for +1 to hit (BS2+ autocannons),
hold it back as the safe OC6 home anchor + Suppression. Regenerated all 3 docs.

Co-Authored-By: Claude Opus 4.8 (1M context) <noreply@anthropic.com>
</commit_message>
<xml_diff>
--- a/docs/Reports & Plans/LSO-Runbook.docx
+++ b/docs/Reports & Plans/LSO-Runbook.docx
@@ -1381,6 +1381,20 @@
       </w:r>
       <w:r>
         <w:t>(1) invuln-NEGATION: Anti-Vehicle/Monster X+ (wound regardless of S) + Devastating Wounds (crit-&gt;mortal); (2) massed AP-2+ VOLUME (5++ fails 68%); (3) MELEE into the no-invuln fight phase; (4) out-OC / out-score.</w:t>
+      </w:r>
+    </w:p>
+    <w:p>
+      <w:pPr>
+        <w:pStyle w:val="ListBullet"/>
+      </w:pPr>
+      <w:r>
+        <w:rPr>
+          <w:b/>
+        </w:rPr>
+        <w:t xml:space="preserve">Helverin Bondsman (EVERY TURN) — </w:t>
+      </w:r>
+      <w:r>
+        <w:t>Keep the Armiger Helverin within Bondsman range of the KNIGHT CRUSADER -&gt; Crusader's Duty = +1 to hit = BS2+ on its 8 autocannon shots (48"). It is your SAFE backfield/home OC6 anchor + Suppression (-1 to hit its target) -- do NOT push it forward, and don't let it drift out of the Crusader's bond.</w:t>
       </w:r>
     </w:p>
     <w:p>

</xml_diff>

<commit_message>
audit: fix last stray 'un-shockable OC22' in the Knights GV-mirror matchup
Co-Authored-By: Claude Opus 4.8 (1M context) <noreply@anthropic.com>
</commit_message>
<xml_diff>
--- a/docs/Reports & Plans/LSO-Runbook.docx
+++ b/docs/Reports & Plans/LSO-Runbook.docx
@@ -2988,7 +2988,7 @@
           </w:tcPr>
           <w:p>
             <w:r>
-              <w:t>Unsaveable Sternguard Dev (full wound-reroll vs Oath) + sticky OC10 Intercessors + un-shockable OC22 Lysander Terminator brick + Armour of Contempt + a ~30-34 Oath-convergence alpha. Sisters 98-31 lesson: durable + sticky + volume.</w:t>
+              <w:t>Unsaveable Sternguard Dev (full wound-reroll vs Oath) + sticky OC10 Intercessors + an OC22 Lysander Terminator brick (NOT battle-shock-immune, but Knights have no way to force a test) + Armour of Contempt + a ~30-34 Oath-convergence alpha. Sisters 98-31 lesson: durable + sticky + volume.</w:t>
             </w:r>
           </w:p>
         </w:tc>
@@ -6680,7 +6680,7 @@
         <w:t xml:space="preserve">Deciding factor: </w:t>
       </w:r>
       <w:r>
-        <w:t>Unsaveable Sternguard Dev (full wound-reroll vs Oath) + sticky OC10 Intercessors + un-shockable OC22 Lysander Terminator brick + Armour of Contempt + a ~30-34 Oath-convergence alpha. Sisters 98-31 lesson: durable + sticky + volume.</w:t>
+        <w:t>Unsaveable Sternguard Dev (full wound-reroll vs Oath) + sticky OC10 Intercessors + an OC22 Lysander Terminator brick (NOT battle-shock-immune, but Knights have no way to force a test) + Armour of Contempt + a ~30-34 Oath-convergence alpha. Sisters 98-31 lesson: durable + sticky + volume.</w:t>
       </w:r>
     </w:p>
     <w:p>

</xml_diff>